<commit_message>
Add Senior SDE role, move AI Champion there
</commit_message>
<xml_diff>
--- a/Resume_Aaron_Collins.docx
+++ b/Resume_Aaron_Collins.docx
@@ -23,7 +23,7 @@
         <w:spacing w:after="0" w:before="20"/>
         <w:jc w:val="center"/>
       </w:pPr>
-      <w:hyperlink w:history="1" r:id="rIdxf0ooc_m5z5vq2e3qb4gl">
+      <w:hyperlink w:history="1" r:id="rIdzuqcvfnhu-b94dwcri2qx">
         <w:r>
           <w:rPr>
             <w:rFonts w:ascii="Cambria" w:cs="Cambria" w:eastAsia="Cambria" w:hAnsi="Cambria"/>
@@ -59,7 +59,7 @@
         </w:rPr>
         <w:t xml:space="preserve">  |  </w:t>
       </w:r>
-      <w:hyperlink w:history="1" r:id="rId_eoyfmoijyroig-67xcki">
+      <w:hyperlink w:history="1" r:id="rIdc9qjh-xhxvuzgmmfwquoe">
         <w:r>
           <w:rPr>
             <w:rFonts w:ascii="Cambria" w:cs="Cambria" w:eastAsia="Cambria" w:hAnsi="Cambria"/>
@@ -79,7 +79,7 @@
         </w:rPr>
         <w:t xml:space="preserve">  |  </w:t>
       </w:r>
-      <w:hyperlink w:history="1" r:id="rId-ljal_ktimufjuranzglg">
+      <w:hyperlink w:history="1" r:id="rIdidvfenusnnhlbdu2cwtpx">
         <w:r>
           <w:rPr>
             <w:rFonts w:ascii="Cambria" w:cs="Cambria" w:eastAsia="Cambria" w:hAnsi="Cambria"/>
@@ -122,7 +122,7 @@
           <w:sz w:val="22"/>
           <w:szCs w:val="22"/>
         </w:rPr>
-        <w:t xml:space="preserve">Software Development Engineer II</w:t>
+        <w:t xml:space="preserve">Senior Software Development Engineer</w:t>
       </w:r>
     </w:p>
     <w:p>
@@ -166,61 +166,61 @@
           <w:sz w:val="21"/>
           <w:szCs w:val="21"/>
         </w:rPr>
-        <w:t xml:space="preserve">Oct 2024 - Present</w:t>
-      </w:r>
-    </w:p>
-    <w:p>
-      <w:pPr>
-        <w:pStyle w:val="ListParagraph"/>
-        <w:numPr>
-          <w:ilvl w:val="0"/>
-          <w:numId w:val="2"/>
-        </w:numPr>
-        <w:spacing w:after="15" w:before="15"/>
-      </w:pPr>
-      <w:r>
-        <w:rPr>
-          <w:rFonts w:ascii="Cambria" w:cs="Cambria" w:eastAsia="Cambria" w:hAnsi="Cambria"/>
-          <w:sz w:val="21"/>
-          <w:szCs w:val="21"/>
-        </w:rPr>
-        <w:t xml:space="preserve">Retail Media / Onsite Ads / Fullstack Engineering Project SME: Led major overhaul of Ads "Forecasting" (</w:t>
-      </w:r>
-      <w:r>
-        <w:rPr>
-          <w:rFonts w:ascii="Cambria" w:cs="Cambria" w:eastAsia="Cambria" w:hAnsi="Cambria"/>
-          <w:b/>
-          <w:bCs/>
-          <w:sz w:val="21"/>
-          <w:szCs w:val="21"/>
-        </w:rPr>
-        <w:t xml:space="preserve">ad delivery demand prediction</w:t>
-      </w:r>
-      <w:r>
-        <w:rPr>
-          <w:rFonts w:ascii="Cambria" w:cs="Cambria" w:eastAsia="Cambria" w:hAnsi="Cambria"/>
-          <w:sz w:val="21"/>
-          <w:szCs w:val="21"/>
-        </w:rPr>
-        <w:t xml:space="preserve">) system and built new modules that significantly improved forecast accuracy. Owned pipeline, backend infrastructure, and business requirements implementation. Collaborated cross-team for ad approval workflows (C#/.NET 8-10, Angular).</w:t>
-      </w:r>
-    </w:p>
-    <w:p>
-      <w:pPr>
-        <w:pStyle w:val="ListParagraph"/>
-        <w:numPr>
-          <w:ilvl w:val="0"/>
-          <w:numId w:val="2"/>
-        </w:numPr>
-        <w:spacing w:after="15" w:before="15"/>
-      </w:pPr>
-      <w:r>
-        <w:rPr>
-          <w:rFonts w:ascii="Cambria" w:cs="Cambria" w:eastAsia="Cambria" w:hAnsi="Cambria"/>
-          <w:sz w:val="21"/>
-          <w:szCs w:val="21"/>
-        </w:rPr>
-        <w:t xml:space="preserve">Owned full project lifecycles from architecture through delivery, driving measurable business impact across cross-domain Onsite Ads initiatives.</w:t>
+        <w:t xml:space="preserve">Apr 2026 - Present</w:t>
+      </w:r>
+    </w:p>
+    <w:p>
+      <w:pPr>
+        <w:pStyle w:val="ListParagraph"/>
+        <w:numPr>
+          <w:ilvl w:val="0"/>
+          <w:numId w:val="2"/>
+        </w:numPr>
+        <w:spacing w:after="15" w:before="15"/>
+      </w:pPr>
+      <w:r>
+        <w:rPr>
+          <w:rFonts w:ascii="Cambria" w:cs="Cambria" w:eastAsia="Cambria" w:hAnsi="Cambria"/>
+          <w:sz w:val="21"/>
+          <w:szCs w:val="21"/>
+        </w:rPr>
+        <w:t xml:space="preserve">Retail Media / Onsite Ads / Activation SME: Driving major re-architecture of ad approval systems to improve configuration flexibility. Own Ads "Activation" (</w:t>
+      </w:r>
+      <w:r>
+        <w:rPr>
+          <w:rFonts w:ascii="Cambria" w:cs="Cambria" w:eastAsia="Cambria" w:hAnsi="Cambria"/>
+          <w:b/>
+          <w:bCs/>
+          <w:sz w:val="21"/>
+          <w:szCs w:val="21"/>
+        </w:rPr>
+        <w:t xml:space="preserve">ad validation and delivery push</w:t>
+      </w:r>
+      <w:r>
+        <w:rPr>
+          <w:rFonts w:ascii="Cambria" w:cs="Cambria" w:eastAsia="Cambria" w:hAnsi="Cambria"/>
+          <w:sz w:val="21"/>
+          <w:szCs w:val="21"/>
+        </w:rPr>
+        <w:t xml:space="preserve">) pipelines, backend, and UI. Collaborate cross-team for ad delivery workflows (C#/.NET 10, Angular).</w:t>
+      </w:r>
+    </w:p>
+    <w:p>
+      <w:pPr>
+        <w:pStyle w:val="ListParagraph"/>
+        <w:numPr>
+          <w:ilvl w:val="0"/>
+          <w:numId w:val="2"/>
+        </w:numPr>
+        <w:spacing w:after="15" w:before="15"/>
+      </w:pPr>
+      <w:r>
+        <w:rPr>
+          <w:rFonts w:ascii="Cambria" w:cs="Cambria" w:eastAsia="Cambria" w:hAnsi="Cambria"/>
+          <w:sz w:val="21"/>
+          <w:szCs w:val="21"/>
+        </w:rPr>
+        <w:t xml:space="preserve">Project SME and core contributor to the Ad Diagnostic tool MVP (identifying why configured ads do not serve), designed to significantly reduce troubleshooting time and help advertisers get campaigns live faster.</w:t>
       </w:r>
     </w:p>
     <w:p>
@@ -239,78 +239,6 @@
           <w:szCs w:val="21"/>
         </w:rPr>
         <w:t xml:space="preserve">Selected as AI Champion by senior leadership: driving AI adoption, onboarding engineers to AI tooling and workflows, and tracking cross-org AI initiatives. Measured via dedicated OKR.</w:t>
-      </w:r>
-    </w:p>
-    <w:p>
-      <w:pPr>
-        <w:pStyle w:val="ListParagraph"/>
-        <w:numPr>
-          <w:ilvl w:val="0"/>
-          <w:numId w:val="2"/>
-        </w:numPr>
-        <w:spacing w:after="15" w:before="15"/>
-      </w:pPr>
-      <w:r>
-        <w:rPr>
-          <w:rFonts w:ascii="Cambria" w:cs="Cambria" w:eastAsia="Cambria" w:hAnsi="Cambria"/>
-          <w:sz w:val="21"/>
-          <w:szCs w:val="21"/>
-        </w:rPr>
-        <w:t xml:space="preserve">Built </w:t>
-      </w:r>
-      <w:r>
-        <w:rPr>
-          <w:rFonts w:ascii="Cambria" w:cs="Cambria" w:eastAsia="Cambria" w:hAnsi="Cambria"/>
-          <w:b/>
-          <w:bCs/>
-          <w:sz w:val="21"/>
-          <w:szCs w:val="21"/>
-        </w:rPr>
-        <w:t xml:space="preserve">ForgeBot</w:t>
-      </w:r>
-      <w:r>
-        <w:rPr>
-          <w:rFonts w:ascii="Cambria" w:cs="Cambria" w:eastAsia="Cambria" w:hAnsi="Cambria"/>
-          <w:sz w:val="21"/>
-          <w:szCs w:val="21"/>
-        </w:rPr>
-        <w:t xml:space="preserve">, a Slack-integrated AI coding agent (Anthropic Agent SDK). Engineers interact with it directly in Slack channels to fix bugs, add features, or summarize topics, reducing context-switching overhead.</w:t>
-      </w:r>
-    </w:p>
-    <w:p>
-      <w:pPr>
-        <w:pStyle w:val="ListParagraph"/>
-        <w:numPr>
-          <w:ilvl w:val="0"/>
-          <w:numId w:val="2"/>
-        </w:numPr>
-        <w:spacing w:after="15" w:before="15"/>
-      </w:pPr>
-      <w:r>
-        <w:rPr>
-          <w:rFonts w:ascii="Cambria" w:cs="Cambria" w:eastAsia="Cambria" w:hAnsi="Cambria"/>
-          <w:sz w:val="21"/>
-          <w:szCs w:val="21"/>
-        </w:rPr>
-        <w:t xml:space="preserve">Developed </w:t>
-      </w:r>
-      <w:r>
-        <w:rPr>
-          <w:rFonts w:ascii="Cambria" w:cs="Cambria" w:eastAsia="Cambria" w:hAnsi="Cambria"/>
-          <w:b/>
-          <w:bCs/>
-          <w:sz w:val="21"/>
-          <w:szCs w:val="21"/>
-        </w:rPr>
-        <w:t xml:space="preserve">Claude Code Helper</w:t>
-      </w:r>
-      <w:r>
-        <w:rPr>
-          <w:rFonts w:ascii="Cambria" w:cs="Cambria" w:eastAsia="Cambria" w:hAnsi="Cambria"/>
-          <w:sz w:val="21"/>
-          <w:szCs w:val="21"/>
-        </w:rPr>
-        <w:t xml:space="preserve">, a CLI harness wrapping Claude Code with experimental agent teams, multi-threaded conversations with thread tracking, pre/post-instruction injection, and post-hook scripting. Accessible via private Slack DM. Boosted developer productivity.</w:t>
       </w:r>
     </w:p>
     <w:p>
@@ -325,7 +253,7 @@
           <w:sz w:val="22"/>
           <w:szCs w:val="22"/>
         </w:rPr>
-        <w:t xml:space="preserve">Software Development Engineer</w:t>
+        <w:t xml:space="preserve">Software Development Engineer II</w:t>
       </w:r>
     </w:p>
     <w:p>
@@ -369,61 +297,133 @@
           <w:sz w:val="21"/>
           <w:szCs w:val="21"/>
         </w:rPr>
-        <w:t xml:space="preserve">Oct 2023 - Oct 2024</w:t>
-      </w:r>
-    </w:p>
-    <w:p>
-      <w:pPr>
-        <w:pStyle w:val="ListParagraph"/>
-        <w:numPr>
-          <w:ilvl w:val="0"/>
-          <w:numId w:val="2"/>
-        </w:numPr>
-        <w:spacing w:after="15" w:before="15"/>
-      </w:pPr>
-      <w:r>
-        <w:rPr>
-          <w:rFonts w:ascii="Cambria" w:cs="Cambria" w:eastAsia="Cambria" w:hAnsi="Cambria"/>
-          <w:sz w:val="21"/>
-          <w:szCs w:val="21"/>
-        </w:rPr>
-        <w:t xml:space="preserve">Delivered high-value Onsite Display Ads features including UserNotification, Auction BuyType (auction-based bidding for display line items), and Max Scale (multi-creative support, expanded configuration). Drove strong stakeholder engagement (C#/.NET 6-8, Angular).</w:t>
-      </w:r>
-    </w:p>
-    <w:p>
-      <w:pPr>
-        <w:pStyle w:val="ListParagraph"/>
-        <w:numPr>
-          <w:ilvl w:val="0"/>
-          <w:numId w:val="2"/>
-        </w:numPr>
-        <w:spacing w:after="15" w:before="15"/>
-      </w:pPr>
-      <w:r>
-        <w:rPr>
-          <w:rFonts w:ascii="Cambria" w:cs="Cambria" w:eastAsia="Cambria" w:hAnsi="Cambria"/>
-          <w:sz w:val="21"/>
-          <w:szCs w:val="21"/>
-        </w:rPr>
-        <w:t xml:space="preserve">Resolved critical production bugs with potential for significant financial impact across ad serving systems.</w:t>
-      </w:r>
-    </w:p>
-    <w:p>
-      <w:pPr>
-        <w:pStyle w:val="ListParagraph"/>
-        <w:numPr>
-          <w:ilvl w:val="0"/>
-          <w:numId w:val="2"/>
-        </w:numPr>
-        <w:spacing w:after="15" w:before="15"/>
-      </w:pPr>
-      <w:r>
-        <w:rPr>
-          <w:rFonts w:ascii="Cambria" w:cs="Cambria" w:eastAsia="Cambria" w:hAnsi="Cambria"/>
-          <w:sz w:val="21"/>
-          <w:szCs w:val="21"/>
-        </w:rPr>
-        <w:t xml:space="preserve">Authored operational documentation, Grafana dashboards, and alerting systems, transforming incident response. Go-to knowledge source for Criteo's async AWS messaging infrastructure.</w:t>
+        <w:t xml:space="preserve">Oct 2024 - Apr 2026</w:t>
+      </w:r>
+    </w:p>
+    <w:p>
+      <w:pPr>
+        <w:pStyle w:val="ListParagraph"/>
+        <w:numPr>
+          <w:ilvl w:val="0"/>
+          <w:numId w:val="2"/>
+        </w:numPr>
+        <w:spacing w:after="15" w:before="15"/>
+      </w:pPr>
+      <w:r>
+        <w:rPr>
+          <w:rFonts w:ascii="Cambria" w:cs="Cambria" w:eastAsia="Cambria" w:hAnsi="Cambria"/>
+          <w:sz w:val="21"/>
+          <w:szCs w:val="21"/>
+        </w:rPr>
+        <w:t xml:space="preserve">Retail Media / Onsite Ads / Fullstack Engineering Project SME: Led major overhaul of Ads "Forecasting" (</w:t>
+      </w:r>
+      <w:r>
+        <w:rPr>
+          <w:rFonts w:ascii="Cambria" w:cs="Cambria" w:eastAsia="Cambria" w:hAnsi="Cambria"/>
+          <w:b/>
+          <w:bCs/>
+          <w:sz w:val="21"/>
+          <w:szCs w:val="21"/>
+        </w:rPr>
+        <w:t xml:space="preserve">ad delivery demand prediction</w:t>
+      </w:r>
+      <w:r>
+        <w:rPr>
+          <w:rFonts w:ascii="Cambria" w:cs="Cambria" w:eastAsia="Cambria" w:hAnsi="Cambria"/>
+          <w:sz w:val="21"/>
+          <w:szCs w:val="21"/>
+        </w:rPr>
+        <w:t xml:space="preserve">) system and built new modules that significantly improved forecast accuracy. Owned pipeline, backend infrastructure, and business requirements implementation. Collaborated cross-team for ad approval workflows (C#/.NET 8-10, Angular).</w:t>
+      </w:r>
+    </w:p>
+    <w:p>
+      <w:pPr>
+        <w:pStyle w:val="ListParagraph"/>
+        <w:numPr>
+          <w:ilvl w:val="0"/>
+          <w:numId w:val="2"/>
+        </w:numPr>
+        <w:spacing w:after="15" w:before="15"/>
+      </w:pPr>
+      <w:r>
+        <w:rPr>
+          <w:rFonts w:ascii="Cambria" w:cs="Cambria" w:eastAsia="Cambria" w:hAnsi="Cambria"/>
+          <w:sz w:val="21"/>
+          <w:szCs w:val="21"/>
+        </w:rPr>
+        <w:t xml:space="preserve">Owned full project lifecycles from architecture through delivery, driving measurable business impact across cross-domain Onsite Ads initiatives.</w:t>
+      </w:r>
+    </w:p>
+    <w:p>
+      <w:pPr>
+        <w:pStyle w:val="ListParagraph"/>
+        <w:numPr>
+          <w:ilvl w:val="0"/>
+          <w:numId w:val="2"/>
+        </w:numPr>
+        <w:spacing w:after="15" w:before="15"/>
+      </w:pPr>
+      <w:r>
+        <w:rPr>
+          <w:rFonts w:ascii="Cambria" w:cs="Cambria" w:eastAsia="Cambria" w:hAnsi="Cambria"/>
+          <w:sz w:val="21"/>
+          <w:szCs w:val="21"/>
+        </w:rPr>
+        <w:t xml:space="preserve">Built </w:t>
+      </w:r>
+      <w:r>
+        <w:rPr>
+          <w:rFonts w:ascii="Cambria" w:cs="Cambria" w:eastAsia="Cambria" w:hAnsi="Cambria"/>
+          <w:b/>
+          <w:bCs/>
+          <w:sz w:val="21"/>
+          <w:szCs w:val="21"/>
+        </w:rPr>
+        <w:t xml:space="preserve">ForgeBot</w:t>
+      </w:r>
+      <w:r>
+        <w:rPr>
+          <w:rFonts w:ascii="Cambria" w:cs="Cambria" w:eastAsia="Cambria" w:hAnsi="Cambria"/>
+          <w:sz w:val="21"/>
+          <w:szCs w:val="21"/>
+        </w:rPr>
+        <w:t xml:space="preserve">, a Slack-integrated AI coding agent (Anthropic Agent SDK). Engineers interact with it directly in Slack channels to fix bugs, add features, or summarize topics, reducing context-switching overhead.</w:t>
+      </w:r>
+    </w:p>
+    <w:p>
+      <w:pPr>
+        <w:pStyle w:val="ListParagraph"/>
+        <w:numPr>
+          <w:ilvl w:val="0"/>
+          <w:numId w:val="2"/>
+        </w:numPr>
+        <w:spacing w:after="15" w:before="15"/>
+      </w:pPr>
+      <w:r>
+        <w:rPr>
+          <w:rFonts w:ascii="Cambria" w:cs="Cambria" w:eastAsia="Cambria" w:hAnsi="Cambria"/>
+          <w:sz w:val="21"/>
+          <w:szCs w:val="21"/>
+        </w:rPr>
+        <w:t xml:space="preserve">Developed </w:t>
+      </w:r>
+      <w:r>
+        <w:rPr>
+          <w:rFonts w:ascii="Cambria" w:cs="Cambria" w:eastAsia="Cambria" w:hAnsi="Cambria"/>
+          <w:b/>
+          <w:bCs/>
+          <w:sz w:val="21"/>
+          <w:szCs w:val="21"/>
+        </w:rPr>
+        <w:t xml:space="preserve">Claude Code Helper</w:t>
+      </w:r>
+      <w:r>
+        <w:rPr>
+          <w:rFonts w:ascii="Cambria" w:cs="Cambria" w:eastAsia="Cambria" w:hAnsi="Cambria"/>
+          <w:sz w:val="21"/>
+          <w:szCs w:val="21"/>
+        </w:rPr>
+        <w:t xml:space="preserve">, a CLI harness wrapping Claude Code with experimental agent teams, multi-threaded conversations with thread tracking, pre/post-instruction injection, and post-hook scripting. Accessible via private Slack DM. Boosted developer productivity.</w:t>
       </w:r>
     </w:p>
     <w:p>
@@ -438,7 +438,7 @@
           <w:sz w:val="22"/>
           <w:szCs w:val="22"/>
         </w:rPr>
-        <w:t xml:space="preserve">Software Developer Co-op (2x)</w:t>
+        <w:t xml:space="preserve">Software Development Engineer</w:t>
       </w:r>
     </w:p>
     <w:p>
@@ -456,15 +456,15 @@
           <w:sz w:val="21"/>
           <w:szCs w:val="21"/>
         </w:rPr>
-        <w:t xml:space="preserve">Rocket Innovation Studio</w:t>
-      </w:r>
-      <w:r>
-        <w:rPr>
-          <w:rFonts w:ascii="Cambria" w:cs="Cambria" w:eastAsia="Cambria" w:hAnsi="Cambria"/>
-          <w:sz w:val="21"/>
-          <w:szCs w:val="21"/>
-        </w:rPr>
-        <w:t xml:space="preserve"> (Windsor, ON)</w:t>
+        <w:t xml:space="preserve">Criteo</w:t>
+      </w:r>
+      <w:r>
+        <w:rPr>
+          <w:rFonts w:ascii="Cambria" w:cs="Cambria" w:eastAsia="Cambria" w:hAnsi="Cambria"/>
+          <w:sz w:val="21"/>
+          <w:szCs w:val="21"/>
+        </w:rPr>
+        <w:t xml:space="preserve"> (Ann Arbor, MI)</w:t>
       </w:r>
       <w:r>
         <w:rPr>
@@ -482,25 +482,61 @@
           <w:sz w:val="21"/>
           <w:szCs w:val="21"/>
         </w:rPr>
-        <w:t xml:space="preserve">May - Aug 2021, Jan - May 2022</w:t>
-      </w:r>
-    </w:p>
-    <w:p>
-      <w:pPr>
-        <w:pStyle w:val="ListParagraph"/>
-        <w:numPr>
-          <w:ilvl w:val="0"/>
-          <w:numId w:val="2"/>
-        </w:numPr>
-        <w:spacing w:after="15" w:before="15"/>
-      </w:pPr>
-      <w:r>
-        <w:rPr>
-          <w:rFonts w:ascii="Cambria" w:cs="Cambria" w:eastAsia="Cambria" w:hAnsi="Cambria"/>
-          <w:sz w:val="21"/>
-          <w:szCs w:val="21"/>
-        </w:rPr>
-        <w:t xml:space="preserve">Developed front-end components in Angular 11/AngularJS with full unit test coverage and backend services in .NET Core 3/5/6.</w:t>
+        <w:t xml:space="preserve">Oct 2023 - Oct 2024</w:t>
+      </w:r>
+    </w:p>
+    <w:p>
+      <w:pPr>
+        <w:pStyle w:val="ListParagraph"/>
+        <w:numPr>
+          <w:ilvl w:val="0"/>
+          <w:numId w:val="2"/>
+        </w:numPr>
+        <w:spacing w:after="15" w:before="15"/>
+      </w:pPr>
+      <w:r>
+        <w:rPr>
+          <w:rFonts w:ascii="Cambria" w:cs="Cambria" w:eastAsia="Cambria" w:hAnsi="Cambria"/>
+          <w:sz w:val="21"/>
+          <w:szCs w:val="21"/>
+        </w:rPr>
+        <w:t xml:space="preserve">Delivered high-value Onsite Display Ads features including UserNotification, Auction BuyType (auction-based bidding for display line items), and Max Scale (multi-creative support, expanded configuration). Drove strong stakeholder engagement (C#/.NET 6-8, Angular).</w:t>
+      </w:r>
+    </w:p>
+    <w:p>
+      <w:pPr>
+        <w:pStyle w:val="ListParagraph"/>
+        <w:numPr>
+          <w:ilvl w:val="0"/>
+          <w:numId w:val="2"/>
+        </w:numPr>
+        <w:spacing w:after="15" w:before="15"/>
+      </w:pPr>
+      <w:r>
+        <w:rPr>
+          <w:rFonts w:ascii="Cambria" w:cs="Cambria" w:eastAsia="Cambria" w:hAnsi="Cambria"/>
+          <w:sz w:val="21"/>
+          <w:szCs w:val="21"/>
+        </w:rPr>
+        <w:t xml:space="preserve">Resolved critical production bugs with potential for significant financial impact across ad serving systems.</w:t>
+      </w:r>
+    </w:p>
+    <w:p>
+      <w:pPr>
+        <w:pStyle w:val="ListParagraph"/>
+        <w:numPr>
+          <w:ilvl w:val="0"/>
+          <w:numId w:val="2"/>
+        </w:numPr>
+        <w:spacing w:after="15" w:before="15"/>
+      </w:pPr>
+      <w:r>
+        <w:rPr>
+          <w:rFonts w:ascii="Cambria" w:cs="Cambria" w:eastAsia="Cambria" w:hAnsi="Cambria"/>
+          <w:sz w:val="21"/>
+          <w:szCs w:val="21"/>
+        </w:rPr>
+        <w:t xml:space="preserve">Authored operational documentation, Grafana dashboards, and alerting systems, transforming incident response. Go-to knowledge source for Criteo's async AWS messaging infrastructure.</w:t>
       </w:r>
     </w:p>
     <w:p>
@@ -515,7 +551,7 @@
           <w:sz w:val="22"/>
           <w:szCs w:val="22"/>
         </w:rPr>
-        <w:t xml:space="preserve">Head Teaching Assistant &amp; Lead Research Assistant</w:t>
+        <w:t xml:space="preserve">Software Developer Co-op (2x)</w:t>
       </w:r>
     </w:p>
     <w:p>
@@ -533,7 +569,7 @@
           <w:sz w:val="21"/>
           <w:szCs w:val="21"/>
         </w:rPr>
-        <w:t xml:space="preserve">University of Windsor</w:t>
+        <w:t xml:space="preserve">Rocket Innovation Studio</w:t>
       </w:r>
       <w:r>
         <w:rPr>
@@ -559,6 +595,83 @@
           <w:sz w:val="21"/>
           <w:szCs w:val="21"/>
         </w:rPr>
+        <w:t xml:space="preserve">May - Aug 2021, Jan - May 2022</w:t>
+      </w:r>
+    </w:p>
+    <w:p>
+      <w:pPr>
+        <w:pStyle w:val="ListParagraph"/>
+        <w:numPr>
+          <w:ilvl w:val="0"/>
+          <w:numId w:val="2"/>
+        </w:numPr>
+        <w:spacing w:after="15" w:before="15"/>
+      </w:pPr>
+      <w:r>
+        <w:rPr>
+          <w:rFonts w:ascii="Cambria" w:cs="Cambria" w:eastAsia="Cambria" w:hAnsi="Cambria"/>
+          <w:sz w:val="21"/>
+          <w:szCs w:val="21"/>
+        </w:rPr>
+        <w:t xml:space="preserve">Developed front-end components in Angular 11/AngularJS with full unit test coverage and backend services in .NET Core 3/5/6.</w:t>
+      </w:r>
+    </w:p>
+    <w:p>
+      <w:pPr>
+        <w:spacing w:after="0" w:before="140"/>
+      </w:pPr>
+      <w:r>
+        <w:rPr>
+          <w:rFonts w:ascii="Cambria" w:cs="Cambria" w:eastAsia="Cambria" w:hAnsi="Cambria"/>
+          <w:b/>
+          <w:bCs/>
+          <w:sz w:val="22"/>
+          <w:szCs w:val="22"/>
+        </w:rPr>
+        <w:t xml:space="preserve">Head Teaching Assistant &amp; Lead Research Assistant</w:t>
+      </w:r>
+    </w:p>
+    <w:p>
+      <w:pPr>
+        <w:tabs>
+          <w:tab w:val="right" w:pos="10080"/>
+        </w:tabs>
+        <w:spacing w:after="40" w:before="20"/>
+      </w:pPr>
+      <w:r>
+        <w:rPr>
+          <w:rFonts w:ascii="Cambria" w:cs="Cambria" w:eastAsia="Cambria" w:hAnsi="Cambria"/>
+          <w:b/>
+          <w:bCs/>
+          <w:sz w:val="21"/>
+          <w:szCs w:val="21"/>
+        </w:rPr>
+        <w:t xml:space="preserve">University of Windsor</w:t>
+      </w:r>
+      <w:r>
+        <w:rPr>
+          <w:rFonts w:ascii="Cambria" w:cs="Cambria" w:eastAsia="Cambria" w:hAnsi="Cambria"/>
+          <w:sz w:val="21"/>
+          <w:szCs w:val="21"/>
+        </w:rPr>
+        <w:t xml:space="preserve"> (Windsor, ON)</w:t>
+      </w:r>
+      <w:r>
+        <w:rPr>
+          <w:rFonts w:ascii="Cambria" w:cs="Cambria" w:eastAsia="Cambria" w:hAnsi="Cambria"/>
+          <w:sz w:val="21"/>
+          <w:szCs w:val="21"/>
+        </w:rPr>
+        <w:t xml:space="preserve">	</w:t>
+      </w:r>
+      <w:r>
+        <w:rPr>
+          <w:rFonts w:ascii="Cambria" w:cs="Cambria" w:eastAsia="Cambria" w:hAnsi="Cambria"/>
+          <w:i/>
+          <w:iCs/>
+          <w:sz w:val="21"/>
+          <w:szCs w:val="21"/>
+        </w:rPr>
         <w:t xml:space="preserve">Sep 2021 - Aug 2023</w:t>
       </w:r>
     </w:p>
@@ -615,7 +728,7 @@
         </w:rPr>
         <w:t xml:space="preserve">Published cognitive load recognition paper (Sci-Kit Learn, eye-tracking) at ACR’23, published by Springer. </w:t>
       </w:r>
-      <w:hyperlink w:history="1" r:id="rIdidlkep3u6a1vmkzk0n0qs">
+      <w:hyperlink w:history="1" r:id="rIdhz_p5mjqxskl-ill3wjte">
         <w:r>
           <w:rPr>
             <w:rFonts w:ascii="Cambria" w:cs="Cambria" w:eastAsia="Cambria" w:hAnsi="Cambria"/>
@@ -645,7 +758,7 @@
         </w:rPr>
         <w:t xml:space="preserve">Built configurable ML pipeline for BSM classification in connected driving (Sci-Kit Learn, TensorFlow, Pandas). </w:t>
       </w:r>
-      <w:hyperlink w:history="1" r:id="rIdk6s4-o108vsv3tj0t2yx1">
+      <w:hyperlink w:history="1" r:id="rIdb92_29plshzqm_k2xdfe9">
         <w:r>
           <w:rPr>
             <w:rFonts w:ascii="Cambria" w:cs="Cambria" w:eastAsia="Cambria" w:hAnsi="Cambria"/>
@@ -729,7 +842,7 @@
         </w:rPr>
         <w:t xml:space="preserve">Autonomous AI development loop that works in any repo. Cross-platform (Linux, macOS, Windows), 13+ GitHub stars. </w:t>
       </w:r>
-      <w:hyperlink w:history="1" r:id="rId2_qxfbu8003axfqybxhej">
+      <w:hyperlink w:history="1" r:id="rIdkxqyfhmv5w7gmmre8eld0">
         <w:r>
           <w:rPr>
             <w:rFonts w:ascii="Cambria" w:cs="Cambria" w:eastAsia="Cambria" w:hAnsi="Cambria"/>
@@ -749,7 +862,7 @@
         </w:rPr>
         <w:t xml:space="preserve"> | </w:t>
       </w:r>
-      <w:hyperlink w:history="1" r:id="rIdgis-0vc8nmbi4fbnhs7gj">
+      <w:hyperlink w:history="1" r:id="rIdeo6zqazbvn9dyumttvklr">
         <w:r>
           <w:rPr>
             <w:rFonts w:ascii="Cambria" w:cs="Cambria" w:eastAsia="Cambria" w:hAnsi="Cambria"/>
@@ -815,7 +928,7 @@
         </w:rPr>
         <w:t xml:space="preserve">Personal AI life assistant accessible via Slack, Discord, and voice calls. Manages emails, preps tax documents, makes phone calls, and works on side projects autonomously using skills/MCP integrations. </w:t>
       </w:r>
-      <w:hyperlink w:history="1" r:id="rId_qv-4qjapdkeorwmva7wq">
+      <w:hyperlink w:history="1" r:id="rId88lm6hj4irsagyrck7tm6">
         <w:r>
           <w:rPr>
             <w:rFonts w:ascii="Cambria" w:cs="Cambria" w:eastAsia="Cambria" w:hAnsi="Cambria"/>
@@ -835,7 +948,7 @@
         </w:rPr>
         <w:t xml:space="preserve"> | </w:t>
       </w:r>
-      <w:hyperlink w:history="1" r:id="rIdjhtl4kusobvmhf3empf3e">
+      <w:hyperlink w:history="1" r:id="rIdko4lfqn_jebczkvoyztrk">
         <w:r>
           <w:rPr>
             <w:rFonts w:ascii="Cambria" w:cs="Cambria" w:eastAsia="Cambria" w:hAnsi="Cambria"/>
@@ -855,7 +968,7 @@
         </w:rPr>
         <w:t xml:space="preserve"> | </w:t>
       </w:r>
-      <w:hyperlink w:history="1" r:id="rIdxc9i9nikpy0fsjd3r2jc3">
+      <w:hyperlink w:history="1" r:id="rId4jzkizzpytm6lgsiwoxpp">
         <w:r>
           <w:rPr>
             <w:rFonts w:ascii="Cambria" w:cs="Cambria" w:eastAsia="Cambria" w:hAnsi="Cambria"/>
@@ -921,7 +1034,7 @@
         </w:rPr>
         <w:t xml:space="preserve">Compiler and programming language for Minecraft datapacks with if/else, loops, and variables. Published on PyPI with a VS Code extension. </w:t>
       </w:r>
-      <w:hyperlink w:history="1" r:id="rIdzbexoyikxnez-l0uuc2be">
+      <w:hyperlink w:history="1" r:id="rId5prqvxzqdrqk0r4zuooe-">
         <w:r>
           <w:rPr>
             <w:rFonts w:ascii="Cambria" w:cs="Cambria" w:eastAsia="Cambria" w:hAnsi="Cambria"/>
@@ -941,7 +1054,7 @@
         </w:rPr>
         <w:t xml:space="preserve"> | </w:t>
       </w:r>
-      <w:hyperlink w:history="1" r:id="rIdflhd6wpbbbr1rafcg3cx6">
+      <w:hyperlink w:history="1" r:id="rIdd_z27wnygcx9jf_tc7h9g">
         <w:r>
           <w:rPr>
             <w:rFonts w:ascii="Cambria" w:cs="Cambria" w:eastAsia="Cambria" w:hAnsi="Cambria"/>
@@ -1007,7 +1120,7 @@
         </w:rPr>
         <w:t xml:space="preserve">Desktop automation tool using Python and PyAutoGUI with auto-code generation capabilities. </w:t>
       </w:r>
-      <w:hyperlink w:history="1" r:id="rIdhfypufsvqwoktywrlht5l">
+      <w:hyperlink w:history="1" r:id="rIdcz2zkecvadjnrmlnxqhey">
         <w:r>
           <w:rPr>
             <w:rFonts w:ascii="Cambria" w:cs="Cambria" w:eastAsia="Cambria" w:hAnsi="Cambria"/>
@@ -1027,7 +1140,7 @@
         </w:rPr>
         <w:t xml:space="preserve"> | </w:t>
       </w:r>
-      <w:hyperlink w:history="1" r:id="rIdt03frih1oxankno_kv3uf">
+      <w:hyperlink w:history="1" r:id="rIdc_zx61fkq0zdja4l1bjom">
         <w:r>
           <w:rPr>
             <w:rFonts w:ascii="Cambria" w:cs="Cambria" w:eastAsia="Cambria" w:hAnsi="Cambria"/>
@@ -1093,7 +1206,7 @@
         </w:rPr>
         <w:t xml:space="preserve">ZeroTier GUI client for Arch Linux / Steam Deck. 41+ GitHub stars, popular in the Steam Deck community with active releases via Flatpak. </w:t>
       </w:r>
-      <w:hyperlink w:history="1" r:id="rIdsck1k92pmovpfwxyw92fm">
+      <w:hyperlink w:history="1" r:id="rIdcpf37fcczb25lzbic5abv">
         <w:r>
           <w:rPr>
             <w:rFonts w:ascii="Cambria" w:cs="Cambria" w:eastAsia="Cambria" w:hAnsi="Cambria"/>
@@ -1113,7 +1226,7 @@
         </w:rPr>
         <w:t xml:space="preserve"> | </w:t>
       </w:r>
-      <w:hyperlink w:history="1" r:id="rIdh-jjwxsqxvmaqp83-lteu">
+      <w:hyperlink w:history="1" r:id="rIdevgdododzcwds_t_1lhqw">
         <w:r>
           <w:rPr>
             <w:rFonts w:ascii="Cambria" w:cs="Cambria" w:eastAsia="Cambria" w:hAnsi="Cambria"/>
@@ -1141,7 +1254,7 @@
         </w:rPr>
         <w:t xml:space="preserve">More projects at </w:t>
       </w:r>
-      <w:hyperlink w:history="1" r:id="rIdiltvzjakvleuejhyf3hf8">
+      <w:hyperlink w:history="1" r:id="rIdikjjnfsnnvwys_1amzt5v">
         <w:r>
           <w:rPr>
             <w:rFonts w:ascii="Cambria" w:cs="Cambria" w:eastAsia="Cambria" w:hAnsi="Cambria"/>
@@ -1163,7 +1276,7 @@
         </w:rPr>
         <w:t xml:space="preserve"> | </w:t>
       </w:r>
-      <w:hyperlink w:history="1" r:id="rIdijb81asrh9to7wfroqlup">
+      <w:hyperlink w:history="1" r:id="rIdfoimypg6p1dvx9jrko8zw">
         <w:r>
           <w:rPr>
             <w:rFonts w:ascii="Cambria" w:cs="Cambria" w:eastAsia="Cambria" w:hAnsi="Cambria"/>

</xml_diff>

<commit_message>
Page break before Projects section
</commit_message>
<xml_diff>
--- a/Resume_Aaron_Collins.docx
+++ b/Resume_Aaron_Collins.docx
@@ -23,7 +23,7 @@
         <w:spacing w:after="0" w:before="20"/>
         <w:jc w:val="center"/>
       </w:pPr>
-      <w:hyperlink w:history="1" r:id="rIdzuqcvfnhu-b94dwcri2qx">
+      <w:hyperlink w:history="1" r:id="rIdwyaeiqemp982lrpjwadqo">
         <w:r>
           <w:rPr>
             <w:rFonts w:ascii="Cambria" w:cs="Cambria" w:eastAsia="Cambria" w:hAnsi="Cambria"/>
@@ -59,7 +59,7 @@
         </w:rPr>
         <w:t xml:space="preserve">  |  </w:t>
       </w:r>
-      <w:hyperlink w:history="1" r:id="rIdc9qjh-xhxvuzgmmfwquoe">
+      <w:hyperlink w:history="1" r:id="rIdei29jq_7xqjwgv-l8zsag">
         <w:r>
           <w:rPr>
             <w:rFonts w:ascii="Cambria" w:cs="Cambria" w:eastAsia="Cambria" w:hAnsi="Cambria"/>
@@ -79,7 +79,7 @@
         </w:rPr>
         <w:t xml:space="preserve">  |  </w:t>
       </w:r>
-      <w:hyperlink w:history="1" r:id="rIdidvfenusnnhlbdu2cwtpx">
+      <w:hyperlink w:history="1" r:id="rIdoxrgqwz_oczjptntxls3m">
         <w:r>
           <w:rPr>
             <w:rFonts w:ascii="Cambria" w:cs="Cambria" w:eastAsia="Cambria" w:hAnsi="Cambria"/>
@@ -728,7 +728,7 @@
         </w:rPr>
         <w:t xml:space="preserve">Published cognitive load recognition paper (Sci-Kit Learn, eye-tracking) at ACR’23, published by Springer. </w:t>
       </w:r>
-      <w:hyperlink w:history="1" r:id="rIdhz_p5mjqxskl-ill3wjte">
+      <w:hyperlink w:history="1" r:id="rIdffqn-f5kcq3ogo1gb2evs">
         <w:r>
           <w:rPr>
             <w:rFonts w:ascii="Cambria" w:cs="Cambria" w:eastAsia="Cambria" w:hAnsi="Cambria"/>
@@ -758,7 +758,7 @@
         </w:rPr>
         <w:t xml:space="preserve">Built configurable ML pipeline for BSM classification in connected driving (Sci-Kit Learn, TensorFlow, Pandas). </w:t>
       </w:r>
-      <w:hyperlink w:history="1" r:id="rIdb92_29plshzqm_k2xdfe9">
+      <w:hyperlink w:history="1" r:id="rIdoqtpohrasu_evagjdw0z7">
         <w:r>
           <w:rPr>
             <w:rFonts w:ascii="Cambria" w:cs="Cambria" w:eastAsia="Cambria" w:hAnsi="Cambria"/>
@@ -772,6 +772,11 @@
       </w:hyperlink>
     </w:p>
     <w:p>
+      <w:r>
+        <w:br w:type="page"/>
+      </w:r>
+    </w:p>
+    <w:p>
       <w:pPr>
         <w:pBdr>
           <w:bottom w:val="single" w:color="000000" w:sz="4" w:space="2"/>
@@ -842,7 +847,7 @@
         </w:rPr>
         <w:t xml:space="preserve">Autonomous AI development loop that works in any repo. Cross-platform (Linux, macOS, Windows), 13+ GitHub stars. </w:t>
       </w:r>
-      <w:hyperlink w:history="1" r:id="rIdkxqyfhmv5w7gmmre8eld0">
+      <w:hyperlink w:history="1" r:id="rIddhjvtlpybuqbagzoth0rm">
         <w:r>
           <w:rPr>
             <w:rFonts w:ascii="Cambria" w:cs="Cambria" w:eastAsia="Cambria" w:hAnsi="Cambria"/>
@@ -862,7 +867,7 @@
         </w:rPr>
         <w:t xml:space="preserve"> | </w:t>
       </w:r>
-      <w:hyperlink w:history="1" r:id="rIdeo6zqazbvn9dyumttvklr">
+      <w:hyperlink w:history="1" r:id="rIdrxmpzf3hi93dxqjrdl_hz">
         <w:r>
           <w:rPr>
             <w:rFonts w:ascii="Cambria" w:cs="Cambria" w:eastAsia="Cambria" w:hAnsi="Cambria"/>
@@ -928,7 +933,7 @@
         </w:rPr>
         <w:t xml:space="preserve">Personal AI life assistant accessible via Slack, Discord, and voice calls. Manages emails, preps tax documents, makes phone calls, and works on side projects autonomously using skills/MCP integrations. </w:t>
       </w:r>
-      <w:hyperlink w:history="1" r:id="rId88lm6hj4irsagyrck7tm6">
+      <w:hyperlink w:history="1" r:id="rIdpddm9o4hjxacxmk3w0h3o">
         <w:r>
           <w:rPr>
             <w:rFonts w:ascii="Cambria" w:cs="Cambria" w:eastAsia="Cambria" w:hAnsi="Cambria"/>
@@ -948,7 +953,7 @@
         </w:rPr>
         <w:t xml:space="preserve"> | </w:t>
       </w:r>
-      <w:hyperlink w:history="1" r:id="rIdko4lfqn_jebczkvoyztrk">
+      <w:hyperlink w:history="1" r:id="rId1sdlnubrvh2eidk4beocf">
         <w:r>
           <w:rPr>
             <w:rFonts w:ascii="Cambria" w:cs="Cambria" w:eastAsia="Cambria" w:hAnsi="Cambria"/>
@@ -968,7 +973,7 @@
         </w:rPr>
         <w:t xml:space="preserve"> | </w:t>
       </w:r>
-      <w:hyperlink w:history="1" r:id="rId4jzkizzpytm6lgsiwoxpp">
+      <w:hyperlink w:history="1" r:id="rIdqbbvfbl4ew0hbnraia38j">
         <w:r>
           <w:rPr>
             <w:rFonts w:ascii="Cambria" w:cs="Cambria" w:eastAsia="Cambria" w:hAnsi="Cambria"/>
@@ -1034,7 +1039,7 @@
         </w:rPr>
         <w:t xml:space="preserve">Compiler and programming language for Minecraft datapacks with if/else, loops, and variables. Published on PyPI with a VS Code extension. </w:t>
       </w:r>
-      <w:hyperlink w:history="1" r:id="rId5prqvxzqdrqk0r4zuooe-">
+      <w:hyperlink w:history="1" r:id="rIdmmkn70f56f_18yxs9u_mf">
         <w:r>
           <w:rPr>
             <w:rFonts w:ascii="Cambria" w:cs="Cambria" w:eastAsia="Cambria" w:hAnsi="Cambria"/>
@@ -1054,7 +1059,7 @@
         </w:rPr>
         <w:t xml:space="preserve"> | </w:t>
       </w:r>
-      <w:hyperlink w:history="1" r:id="rIdd_z27wnygcx9jf_tc7h9g">
+      <w:hyperlink w:history="1" r:id="rId046zxc8owlzwu42gzcikf">
         <w:r>
           <w:rPr>
             <w:rFonts w:ascii="Cambria" w:cs="Cambria" w:eastAsia="Cambria" w:hAnsi="Cambria"/>
@@ -1120,7 +1125,7 @@
         </w:rPr>
         <w:t xml:space="preserve">Desktop automation tool using Python and PyAutoGUI with auto-code generation capabilities. </w:t>
       </w:r>
-      <w:hyperlink w:history="1" r:id="rIdcz2zkecvadjnrmlnxqhey">
+      <w:hyperlink w:history="1" r:id="rIdvcmxsjy38-yh1gvg0w5yn">
         <w:r>
           <w:rPr>
             <w:rFonts w:ascii="Cambria" w:cs="Cambria" w:eastAsia="Cambria" w:hAnsi="Cambria"/>
@@ -1140,7 +1145,7 @@
         </w:rPr>
         <w:t xml:space="preserve"> | </w:t>
       </w:r>
-      <w:hyperlink w:history="1" r:id="rIdc_zx61fkq0zdja4l1bjom">
+      <w:hyperlink w:history="1" r:id="rIdoz9txdm9vuaha1ydeiqvm">
         <w:r>
           <w:rPr>
             <w:rFonts w:ascii="Cambria" w:cs="Cambria" w:eastAsia="Cambria" w:hAnsi="Cambria"/>
@@ -1206,7 +1211,7 @@
         </w:rPr>
         <w:t xml:space="preserve">ZeroTier GUI client for Arch Linux / Steam Deck. 41+ GitHub stars, popular in the Steam Deck community with active releases via Flatpak. </w:t>
       </w:r>
-      <w:hyperlink w:history="1" r:id="rIdcpf37fcczb25lzbic5abv">
+      <w:hyperlink w:history="1" r:id="rIdxhm_8sw7lybcenls9o4us">
         <w:r>
           <w:rPr>
             <w:rFonts w:ascii="Cambria" w:cs="Cambria" w:eastAsia="Cambria" w:hAnsi="Cambria"/>
@@ -1226,7 +1231,7 @@
         </w:rPr>
         <w:t xml:space="preserve"> | </w:t>
       </w:r>
-      <w:hyperlink w:history="1" r:id="rIdevgdododzcwds_t_1lhqw">
+      <w:hyperlink w:history="1" r:id="rIdkmfkn8grkxlspiwigt9fi">
         <w:r>
           <w:rPr>
             <w:rFonts w:ascii="Cambria" w:cs="Cambria" w:eastAsia="Cambria" w:hAnsi="Cambria"/>
@@ -1254,7 +1259,7 @@
         </w:rPr>
         <w:t xml:space="preserve">More projects at </w:t>
       </w:r>
-      <w:hyperlink w:history="1" r:id="rIdikjjnfsnnvwys_1amzt5v">
+      <w:hyperlink w:history="1" r:id="rIddc0wtkjouohgbsdnxam5o">
         <w:r>
           <w:rPr>
             <w:rFonts w:ascii="Cambria" w:cs="Cambria" w:eastAsia="Cambria" w:hAnsi="Cambria"/>
@@ -1276,7 +1281,7 @@
         </w:rPr>
         <w:t xml:space="preserve"> | </w:t>
       </w:r>
-      <w:hyperlink w:history="1" r:id="rIdfoimypg6p1dvx9jrko8zw">
+      <w:hyperlink w:history="1" r:id="rIdoymcmjhumkgw6pnnmycfg">
         <w:r>
           <w:rPr>
             <w:rFonts w:ascii="Cambria" w:cs="Cambria" w:eastAsia="Cambria" w:hAnsi="Cambria"/>

</xml_diff>